<commit_message>
Fix: corretto il link ed i riferimenti da AQI01 a AQI02 in tutto il manuale v07 e README
</commit_message>
<xml_diff>
--- a/AQI_Dashboard_Operating_Manual_v06.docx
+++ b/AQI_Dashboard_Operating_Manual_v06.docx
@@ -128,7 +128,7 @@
         <w:rPr>
           <w:color w:val="1155CC"/>
         </w:rPr>
-        <w:t>https://giuse-arte.github.io/AQI01/index.html</w:t>
+        <w:t>https://giuse-arte.github.io/AQI02/index.html</w:t>
       </w:r>
     </w:p>
     <w:p>
@@ -640,6 +640,74 @@
                 <w:color w:val="000000"/>
               </w:rPr>
               <w:t>Gestione multi-centralina: memorizzazione indipendente della configurazione di visualizzazione per ogni centralina. Il reset del setup è ora possibile solo modificando 'Data Inizio', con richiesta di conferma. Il flag 'Ricorda preferenze' governa ora solo la persistenza della selezione grafici; standard AQI, intervallo date, modalità e giorno sono sempre memorizzati per centralina, indipendentemente dal flag. Aggiunto pulsante 'Applica' nel pannello grafici: le modifiche ai singoli grafici richiedono conferma esplicita. Il grafico COMBO PM2.5/PM10 non mostra dati nelle prime 24h successive a 'Data Inizio'.</w:t>
+            </w:r>
+          </w:p>
+        </w:tc>
+      </w:tr>
+      <w:tr>
+        <w:tblPrEx>
+          <w:tblCellMar>
+            <w:top w:w="0" w:type="dxa"/>
+            <w:bottom w:w="0" w:type="dxa"/>
+          </w:tblCellMar>
+        </w:tblPrEx>
+        <w:tc>
+          <w:tcPr>
+            <w:tcW w:w="1600" w:type="dxa"/>
+            <w:shd w:val="clear" w:color="auto" w:fill="F2F2F2"/>
+            <w:tcMar>
+              <w:top w:w="80" w:type="dxa"/>
+              <w:left w:w="100" w:type="dxa"/>
+              <w:bottom w:w="80" w:type="dxa"/>
+              <w:right w:w="100" w:type="dxa"/>
+            </w:tcMar>
+          </w:tcPr>
+          <w:p>
+            <w:r>
+              <w:rPr>
+                <w:color w:val="000000"/>
+              </w:rPr>
+              <w:t>v07.00</w:t>
+            </w:r>
+          </w:p>
+        </w:tc>
+        <w:tc>
+          <w:tcPr>
+            <w:tcW w:w="1600" w:type="dxa"/>
+            <w:shd w:val="clear" w:color="auto" w:fill="F2F2F2"/>
+            <w:tcMar>
+              <w:top w:w="80" w:type="dxa"/>
+              <w:left w:w="100" w:type="dxa"/>
+              <w:bottom w:w="80" w:type="dxa"/>
+              <w:right w:w="100" w:type="dxa"/>
+            </w:tcMar>
+          </w:tcPr>
+          <w:p>
+            <w:r>
+              <w:rPr>
+                <w:color w:val="000000"/>
+              </w:rPr>
+              <w:t>2026-07-27</w:t>
+            </w:r>
+          </w:p>
+        </w:tc>
+        <w:tc>
+          <w:tcPr>
+            <w:tcW w:w="6900" w:type="dxa"/>
+            <w:shd w:val="clear" w:color="auto" w:fill="F2F2F2"/>
+            <w:tcMar>
+              <w:top w:w="80" w:type="dxa"/>
+              <w:left w:w="100" w:type="dxa"/>
+              <w:bottom w:w="80" w:type="dxa"/>
+              <w:right w:w="100" w:type="dxa"/>
+            </w:tcMar>
+          </w:tcPr>
+          <w:p>
+            <w:r>
+              <w:rPr>
+                <w:color w:val="000000"/>
+              </w:rPr>
+              <w:t>Selezione Data Inizio con icona calendario azzurro. Layout KPI Cards a 8 colonne su riga unica con font ingranditi. Reverse Geocoding dell'indirizzo stradale (OpenStreetMap) sotto le coordinate Lat/Long con allineamento verticale. Pulsante Tema Chiaro/Scuro (colore Ocra) posizionato sopra 'Contr. Centraline', con tema Chiaro Pastello ed intestazione grafici blu reale (#1b4db1). Griglie grafici orizzontali/verticali ottimizzate. Menu 'SCEGLI CENTRALINA' con diciture pulite 'Device NÂ° AQI_01' / 'Device NÂ° AQI_02'. Nuova Favicon con logo 3D ufficiale (LOGO_BCV_3D.png).</w:t>
             </w:r>
           </w:p>
         </w:tc>
@@ -2124,6 +2192,11 @@
       <w:r>
         <w:t>4.5 Pulsante Estrai CSV</w:t>
       </w:r>
+    </w:p>
+    <w:p>
+      <w:pPr>
+        <w:spacing w:before="800"/>
+      </w:pPr>
     </w:p>
     <w:p>
       <w:pPr>

</xml_diff>